<commit_message>
Actualizacion de archivo README.md y archviso de evidencias
</commit_message>
<xml_diff>
--- a/evidencia/evidencia.docx
+++ b/evidencia/evidencia.docx
@@ -6,12 +6,49 @@
       <w:pPr>
         <w:pStyle w:val="Normal"/>
         <w:bidi w:val="0"/>
-        <w:jc w:val="start"/>
-        <w:rPr/>
-      </w:pPr>
-      <w:r>
-        <w:rPr/>
-        <w:t xml:space="preserve">1.- </w:t>
+        <w:jc w:val="center"/>
+        <w:rPr>
+          <w:b/>
+          <w:bCs/>
+          <w:sz w:val="36"/>
+          <w:szCs w:val="36"/>
+        </w:rPr>
+      </w:pPr>
+      <w:r>
+        <w:rPr>
+          <w:b/>
+          <w:bCs/>
+          <w:sz w:val="36"/>
+          <w:szCs w:val="36"/>
+        </w:rPr>
+        <w:t>EVIDENCIAS</w:t>
+      </w:r>
+    </w:p>
+    <w:p>
+      <w:pPr>
+        <w:pStyle w:val="Normal"/>
+        <w:bidi w:val="0"/>
+        <w:jc w:val="start"/>
+        <w:rPr/>
+      </w:pPr>
+      <w:r>
+        <w:rPr/>
+      </w:r>
+    </w:p>
+    <w:p>
+      <w:pPr>
+        <w:pStyle w:val="Normal"/>
+        <w:bidi w:val="0"/>
+        <w:jc w:val="start"/>
+        <w:rPr/>
+      </w:pPr>
+      <w:r>
+        <w:rPr/>
+        <w:t>1</w:t>
+      </w:r>
+      <w:r>
+        <w:rPr/>
+        <w:t xml:space="preserve">.- </w:t>
       </w:r>
       <w:r>
         <w:rPr/>
@@ -98,11 +135,15 @@
       </w:pPr>
       <w:r>
         <w:rPr/>
-        <w:t xml:space="preserve">2.- </w:t>
-      </w:r>
-      <w:r>
-        <w:rPr/>
-        <w:t>Ver los nodos activos</w:t>
+        <w:t>2</w:t>
+      </w:r>
+      <w:r>
+        <w:rPr/>
+        <w:t xml:space="preserve">.- </w:t>
+      </w:r>
+      <w:r>
+        <w:rPr/>
+        <w:t>Listado de Nodos del Clúster</w:t>
       </w:r>
     </w:p>
     <w:p>
@@ -174,23 +215,65 @@
       </w:pPr>
       <w:r>
         <w:rPr/>
+      </w:r>
+    </w:p>
+    <w:p>
+      <w:pPr>
+        <w:pStyle w:val="Normal"/>
+        <w:bidi w:val="0"/>
+        <w:jc w:val="start"/>
+        <w:rPr/>
+      </w:pPr>
+      <w:r>
+        <w:rPr/>
         <w:t xml:space="preserve">3.- </w:t>
       </w:r>
       <w:r>
         <w:rPr/>
+        <w:t xml:space="preserve">Obtener los Pods de </w:t>
+      </w:r>
+      <w:r>
+        <w:rPr/>
+        <w:t>la</w:t>
+      </w:r>
+      <w:r>
+        <w:rPr/>
+        <w:t xml:space="preserve"> aplicación</w:t>
+      </w:r>
+    </w:p>
+    <w:p>
+      <w:pPr>
+        <w:pStyle w:val="Normal"/>
+        <w:bidi w:val="0"/>
+        <w:jc w:val="start"/>
+        <w:rPr/>
+      </w:pPr>
+      <w:r>
+        <w:rPr/>
+      </w:r>
+    </w:p>
+    <w:p>
+      <w:pPr>
+        <w:pStyle w:val="Normal"/>
+        <w:bidi w:val="0"/>
+        <w:jc w:val="start"/>
+        <w:rPr/>
+      </w:pPr>
+      <w:r>
+        <w:rPr/>
         <w:drawing>
-          <wp:anchor distT="0" distB="0" distL="0" distR="0" simplePos="0" relativeHeight="4" behindDoc="0" locked="0" layoutInCell="0" allowOverlap="1">
+          <wp:anchor distT="0" distB="0" distL="0" distR="0" simplePos="0" relativeHeight="9" behindDoc="0" locked="0" layoutInCell="0" allowOverlap="1">
             <wp:simplePos x="0" y="0"/>
             <wp:positionH relativeFrom="column">
-              <wp:posOffset>-5080</wp:posOffset>
+              <wp:posOffset>45085</wp:posOffset>
             </wp:positionH>
             <wp:positionV relativeFrom="paragraph">
-              <wp:posOffset>273685</wp:posOffset>
+              <wp:posOffset>635</wp:posOffset>
             </wp:positionV>
-            <wp:extent cx="5479415" cy="1080135"/>
+            <wp:extent cx="6112510" cy="856615"/>
             <wp:effectExtent l="0" t="0" r="0" b="0"/>
             <wp:wrapSquare wrapText="largest"/>
-            <wp:docPr id="3" name="Imagen3"/>
+            <wp:docPr id="3" name="Imagen16"/>
             <wp:cNvGraphicFramePr>
               <a:graphicFrameLocks xmlns:a="http://schemas.openxmlformats.org/drawingml/2006/main" noChangeAspect="1"/>
             </wp:cNvGraphicFramePr>
@@ -198,7 +281,7 @@
               <a:graphicData uri="http://schemas.openxmlformats.org/drawingml/2006/picture">
                 <pic:pic xmlns:pic="http://schemas.openxmlformats.org/drawingml/2006/picture">
                   <pic:nvPicPr>
-                    <pic:cNvPr id="3" name="Imagen3"/>
+                    <pic:cNvPr id="3" name="Imagen16"/>
                     <pic:cNvPicPr>
                       <a:picLocks noChangeAspect="1" noChangeArrowheads="1"/>
                     </pic:cNvPicPr>
@@ -212,7 +295,7 @@
                   <pic:spPr bwMode="auto">
                     <a:xfrm>
                       <a:off x="0" y="0"/>
-                      <a:ext cx="5479415" cy="1080135"/>
+                      <a:ext cx="6112510" cy="856615"/>
                     </a:xfrm>
                     <a:prstGeom prst="rect">
                       <a:avLst/>
@@ -225,98 +308,16 @@
           </wp:anchor>
         </w:drawing>
       </w:r>
-      <w:r>
-        <w:rPr/>
-        <w:t>Aplicar tus manifiestos en Kubernetes</w:t>
-      </w:r>
-    </w:p>
-    <w:p>
-      <w:pPr>
-        <w:pStyle w:val="Normal"/>
-        <w:bidi w:val="0"/>
-        <w:jc w:val="start"/>
-        <w:rPr/>
-      </w:pPr>
-      <w:r>
-        <w:rPr/>
-      </w:r>
-    </w:p>
-    <w:p>
-      <w:pPr>
-        <w:pStyle w:val="Normal"/>
-        <w:bidi w:val="0"/>
-        <w:jc w:val="start"/>
-        <w:rPr/>
-      </w:pPr>
-      <w:r>
-        <w:rPr/>
-      </w:r>
-    </w:p>
-    <w:p>
-      <w:pPr>
-        <w:pStyle w:val="Normal"/>
-        <w:bidi w:val="0"/>
-        <w:jc w:val="start"/>
-        <w:rPr/>
-      </w:pPr>
-      <w:r>
-        <w:rPr/>
-      </w:r>
-    </w:p>
-    <w:p>
-      <w:pPr>
-        <w:pStyle w:val="Normal"/>
-        <w:bidi w:val="0"/>
-        <w:jc w:val="start"/>
-        <w:rPr/>
-      </w:pPr>
-      <w:r>
-        <w:rPr/>
-      </w:r>
-    </w:p>
-    <w:p>
-      <w:pPr>
-        <w:pStyle w:val="Normal"/>
-        <w:bidi w:val="0"/>
-        <w:jc w:val="start"/>
-        <w:rPr/>
-      </w:pPr>
-      <w:r>
-        <w:rPr/>
-      </w:r>
-    </w:p>
-    <w:p>
-      <w:pPr>
-        <w:pStyle w:val="Normal"/>
-        <w:bidi w:val="0"/>
-        <w:jc w:val="start"/>
-        <w:rPr/>
-      </w:pPr>
-      <w:r>
-        <w:rPr/>
-      </w:r>
-    </w:p>
-    <w:p>
-      <w:pPr>
-        <w:pStyle w:val="Normal"/>
-        <w:bidi w:val="0"/>
-        <w:jc w:val="start"/>
-        <w:rPr/>
-      </w:pPr>
-      <w:r>
-        <w:rPr/>
-      </w:r>
-    </w:p>
-    <w:p>
-      <w:pPr>
-        <w:pStyle w:val="Normal"/>
-        <w:bidi w:val="0"/>
-        <w:jc w:val="start"/>
-        <w:rPr/>
-      </w:pPr>
-      <w:r>
-        <w:rPr/>
-        <w:t xml:space="preserve"> </w:t>
+    </w:p>
+    <w:p>
+      <w:pPr>
+        <w:pStyle w:val="Normal"/>
+        <w:bidi w:val="0"/>
+        <w:jc w:val="start"/>
+        <w:rPr/>
+      </w:pPr>
+      <w:r>
+        <w:rPr/>
       </w:r>
     </w:p>
     <w:p>
@@ -331,53 +332,58 @@
         <w:t xml:space="preserve">4.- </w:t>
       </w:r>
       <w:r>
-        <w:rPr/>
-        <w:t>Validar el ConfigMap y el Secret</w:t>
-      </w:r>
-    </w:p>
-    <w:p>
-      <w:pPr>
-        <w:pStyle w:val="Normal"/>
-        <w:bidi w:val="0"/>
-        <w:jc w:val="start"/>
-        <w:rPr/>
-      </w:pPr>
-      <w:r>
-        <w:rPr/>
-      </w:r>
-    </w:p>
-    <w:p>
-      <w:pPr>
-        <w:pStyle w:val="Normal"/>
-        <w:bidi w:val="0"/>
-        <w:jc w:val="start"/>
-        <w:rPr/>
-      </w:pPr>
-      <w:r>
-        <w:rPr/>
-      </w:r>
-    </w:p>
-    <w:p>
-      <w:pPr>
-        <w:pStyle w:val="Normal"/>
-        <w:bidi w:val="0"/>
-        <w:jc w:val="start"/>
-        <w:rPr/>
-      </w:pPr>
-      <w:r>
+        <w:rPr>
+          <w:b w:val="false"/>
+          <w:bCs w:val="false"/>
+        </w:rPr>
+        <w:t>Obtener el Deployment</w:t>
+      </w:r>
+    </w:p>
+    <w:p>
+      <w:pPr>
+        <w:pStyle w:val="Normal"/>
+        <w:bidi w:val="0"/>
+        <w:jc w:val="start"/>
+        <w:rPr>
+          <w:b w:val="false"/>
+          <w:bCs w:val="false"/>
+        </w:rPr>
+      </w:pPr>
+      <w:r>
+        <w:rPr>
+          <w:b w:val="false"/>
+          <w:bCs w:val="false"/>
+        </w:rPr>
+      </w:r>
+    </w:p>
+    <w:p>
+      <w:pPr>
+        <w:pStyle w:val="Normal"/>
+        <w:bidi w:val="0"/>
+        <w:jc w:val="start"/>
+        <w:rPr>
+          <w:b w:val="false"/>
+          <w:bCs w:val="false"/>
+        </w:rPr>
+      </w:pPr>
+      <w:r>
+        <w:rPr>
+          <w:b w:val="false"/>
+          <w:bCs w:val="false"/>
+        </w:rPr>
         <w:drawing>
-          <wp:anchor distT="0" distB="0" distL="0" distR="0" simplePos="0" relativeHeight="5" behindDoc="0" locked="0" layoutInCell="0" allowOverlap="1">
+          <wp:anchor distT="0" distB="0" distL="0" distR="0" simplePos="0" relativeHeight="10" behindDoc="0" locked="0" layoutInCell="0" allowOverlap="1">
             <wp:simplePos x="0" y="0"/>
             <wp:positionH relativeFrom="column">
-              <wp:align>center</wp:align>
+              <wp:posOffset>5715</wp:posOffset>
             </wp:positionH>
             <wp:positionV relativeFrom="paragraph">
               <wp:posOffset>635</wp:posOffset>
             </wp:positionV>
-            <wp:extent cx="6332220" cy="615315"/>
+            <wp:extent cx="5501005" cy="756285"/>
             <wp:effectExtent l="0" t="0" r="0" b="0"/>
             <wp:wrapSquare wrapText="largest"/>
-            <wp:docPr id="4" name="Imagen4"/>
+            <wp:docPr id="4" name="Imagen17"/>
             <wp:cNvGraphicFramePr>
               <a:graphicFrameLocks xmlns:a="http://schemas.openxmlformats.org/drawingml/2006/main" noChangeAspect="1"/>
             </wp:cNvGraphicFramePr>
@@ -385,7 +391,7 @@
               <a:graphicData uri="http://schemas.openxmlformats.org/drawingml/2006/picture">
                 <pic:pic xmlns:pic="http://schemas.openxmlformats.org/drawingml/2006/picture">
                   <pic:nvPicPr>
-                    <pic:cNvPr id="4" name="Imagen4"/>
+                    <pic:cNvPr id="4" name="Imagen17"/>
                     <pic:cNvPicPr>
                       <a:picLocks noChangeAspect="1" noChangeArrowheads="1"/>
                     </pic:cNvPicPr>
@@ -399,7 +405,7 @@
                   <pic:spPr bwMode="auto">
                     <a:xfrm>
                       <a:off x="0" y="0"/>
-                      <a:ext cx="6332220" cy="615315"/>
+                      <a:ext cx="5501005" cy="756285"/>
                     </a:xfrm>
                     <a:prstGeom prst="rect">
                       <a:avLst/>
@@ -411,19 +417,124 @@
             </a:graphic>
           </wp:anchor>
         </w:drawing>
+      </w:r>
+    </w:p>
+    <w:p>
+      <w:pPr>
+        <w:pStyle w:val="Normal"/>
+        <w:bidi w:val="0"/>
+        <w:jc w:val="start"/>
+        <w:rPr>
+          <w:b w:val="false"/>
+          <w:bCs w:val="false"/>
+        </w:rPr>
+      </w:pPr>
+      <w:r>
+        <w:rPr>
+          <w:b w:val="false"/>
+          <w:bCs w:val="false"/>
+        </w:rPr>
+      </w:r>
+    </w:p>
+    <w:p>
+      <w:pPr>
+        <w:pStyle w:val="Normal"/>
+        <w:bidi w:val="0"/>
+        <w:jc w:val="start"/>
+        <w:rPr>
+          <w:b w:val="false"/>
+          <w:bCs w:val="false"/>
+        </w:rPr>
+      </w:pPr>
+      <w:r>
+        <w:rPr>
+          <w:b w:val="false"/>
+          <w:bCs w:val="false"/>
+        </w:rPr>
+      </w:r>
+    </w:p>
+    <w:p>
+      <w:pPr>
+        <w:pStyle w:val="Normal"/>
+        <w:bidi w:val="0"/>
+        <w:jc w:val="start"/>
+        <w:rPr/>
+      </w:pPr>
+      <w:r>
+        <w:rPr/>
+      </w:r>
+    </w:p>
+    <w:p>
+      <w:pPr>
+        <w:pStyle w:val="Normal"/>
+        <w:bidi w:val="0"/>
+        <w:jc w:val="start"/>
+        <w:rPr/>
+      </w:pPr>
+      <w:r>
+        <w:rPr/>
+      </w:r>
+    </w:p>
+    <w:p>
+      <w:pPr>
+        <w:pStyle w:val="Normal"/>
+        <w:bidi w:val="0"/>
+        <w:jc w:val="start"/>
+        <w:rPr/>
+      </w:pPr>
+      <w:r>
+        <w:rPr/>
+        <w:t xml:space="preserve">5.- </w:t>
+      </w:r>
+      <w:r>
+        <w:rPr/>
+        <w:t>Obtener el Servicio</w:t>
+      </w:r>
+    </w:p>
+    <w:p>
+      <w:pPr>
+        <w:pStyle w:val="Normal"/>
+        <w:bidi w:val="0"/>
+        <w:jc w:val="start"/>
+        <w:rPr/>
+      </w:pPr>
+      <w:r>
+        <w:rPr/>
+      </w:r>
+    </w:p>
+    <w:p>
+      <w:pPr>
+        <w:pStyle w:val="Normal"/>
+        <w:bidi w:val="0"/>
+        <w:jc w:val="start"/>
+        <w:rPr/>
+      </w:pPr>
+      <w:r>
+        <w:rPr/>
+      </w:r>
+    </w:p>
+    <w:p>
+      <w:pPr>
+        <w:pStyle w:val="Normal"/>
+        <w:bidi w:val="0"/>
+        <w:jc w:val="start"/>
+        <w:rPr/>
+      </w:pPr>
+      <w:r>
+        <w:rPr/>
         <w:drawing>
-          <wp:anchor distT="0" distB="0" distL="0" distR="0" simplePos="0" relativeHeight="6" behindDoc="0" locked="0" layoutInCell="0" allowOverlap="1">
+          <wp:anchor distT="0" distB="0" distL="0" distR="0" simplePos="0" relativeHeight="11" behindDoc="0" locked="0" layoutInCell="0" allowOverlap="1">
             <wp:simplePos x="0" y="0"/>
             <wp:positionH relativeFrom="column">
-              <wp:posOffset>0</wp:posOffset>
+              <wp:align>center</wp:align>
             </wp:positionH>
             <wp:positionV relativeFrom="paragraph">
-              <wp:posOffset>756285</wp:posOffset>
+              <wp:posOffset>635</wp:posOffset>
             </wp:positionV>
-            <wp:extent cx="6332220" cy="617220"/>
+            <wp:extent cx="6332220" cy="646430"/>
             <wp:effectExtent l="0" t="0" r="0" b="0"/>
             <wp:wrapSquare wrapText="largest"/>
-            <wp:docPr id="5" name="Imagen5"/>
+            <wp:docPr id="5" name="Imagen18"/>
             <wp:cNvGraphicFramePr>
               <a:graphicFrameLocks xmlns:a="http://schemas.openxmlformats.org/drawingml/2006/main" noChangeAspect="1"/>
             </wp:cNvGraphicFramePr>
@@ -431,7 +542,7 @@
               <a:graphicData uri="http://schemas.openxmlformats.org/drawingml/2006/picture">
                 <pic:pic xmlns:pic="http://schemas.openxmlformats.org/drawingml/2006/picture">
                   <pic:nvPicPr>
-                    <pic:cNvPr id="5" name="Imagen5"/>
+                    <pic:cNvPr id="5" name="Imagen18"/>
                     <pic:cNvPicPr>
                       <a:picLocks noChangeAspect="1" noChangeArrowheads="1"/>
                     </pic:cNvPicPr>
@@ -445,7 +556,7 @@
                   <pic:spPr bwMode="auto">
                     <a:xfrm>
                       <a:off x="0" y="0"/>
-                      <a:ext cx="6332220" cy="617220"/>
+                      <a:ext cx="6332220" cy="646430"/>
                     </a:xfrm>
                     <a:prstGeom prst="rect">
                       <a:avLst/>
@@ -458,71 +569,75 @@
           </wp:anchor>
         </w:drawing>
       </w:r>
-      <w:r>
-        <w:rPr/>
-        <w:t xml:space="preserve"> </w:t>
-      </w:r>
-    </w:p>
-    <w:p>
-      <w:pPr>
-        <w:pStyle w:val="Normal"/>
-        <w:bidi w:val="0"/>
-        <w:jc w:val="start"/>
-        <w:rPr/>
-      </w:pPr>
-      <w:r>
-        <w:rPr/>
-      </w:r>
-    </w:p>
-    <w:p>
-      <w:pPr>
-        <w:pStyle w:val="Normal"/>
-        <w:bidi w:val="0"/>
-        <w:jc w:val="start"/>
-        <w:rPr/>
-      </w:pPr>
-      <w:r>
-        <w:rPr/>
-        <w:t xml:space="preserve">5.- </w:t>
-      </w:r>
-      <w:r>
-        <w:rPr/>
-        <w:t xml:space="preserve">Verificar que </w:t>
-      </w:r>
-      <w:r>
-        <w:rPr/>
-        <w:t>los</w:t>
-      </w:r>
-      <w:r>
-        <w:rPr/>
-        <w:t xml:space="preserve"> Pods estén </w:t>
-      </w:r>
-      <w:r>
-        <w:rPr/>
-        <w:t>ejecutandose</w:t>
-      </w:r>
-    </w:p>
-    <w:p>
-      <w:pPr>
-        <w:pStyle w:val="Normal"/>
-        <w:bidi w:val="0"/>
-        <w:jc w:val="start"/>
-        <w:rPr/>
-      </w:pPr>
-      <w:r>
+    </w:p>
+    <w:p>
+      <w:pPr>
+        <w:pStyle w:val="Normal"/>
+        <w:bidi w:val="0"/>
+        <w:jc w:val="start"/>
+        <w:rPr/>
+      </w:pPr>
+      <w:r>
+        <w:rPr/>
+      </w:r>
+    </w:p>
+    <w:p>
+      <w:pPr>
+        <w:pStyle w:val="Normal"/>
+        <w:bidi w:val="0"/>
+        <w:jc w:val="start"/>
+        <w:rPr/>
+      </w:pPr>
+      <w:r>
+        <w:rPr/>
+        <w:t xml:space="preserve">6.- </w:t>
+      </w:r>
+      <w:r>
+        <w:rPr/>
+        <w:t xml:space="preserve">Ver los Logs de </w:t>
+      </w:r>
+      <w:r>
+        <w:rPr/>
+        <w:t>la</w:t>
+      </w:r>
+      <w:r>
+        <w:rPr/>
+        <w:t xml:space="preserve"> aplicación NestJS</w:t>
+      </w:r>
+    </w:p>
+    <w:p>
+      <w:pPr>
+        <w:pStyle w:val="Normal"/>
+        <w:bidi w:val="0"/>
+        <w:jc w:val="start"/>
+        <w:rPr/>
+      </w:pPr>
+      <w:r>
+        <w:rPr/>
+      </w:r>
+    </w:p>
+    <w:p>
+      <w:pPr>
+        <w:pStyle w:val="Normal"/>
+        <w:bidi w:val="0"/>
+        <w:jc w:val="start"/>
+        <w:rPr/>
+      </w:pPr>
+      <w:r>
+        <w:rPr/>
         <w:drawing>
-          <wp:anchor distT="0" distB="0" distL="0" distR="0" simplePos="0" relativeHeight="7" behindDoc="0" locked="0" layoutInCell="0" allowOverlap="1">
+          <wp:anchor distT="0" distB="0" distL="0" distR="0" simplePos="0" relativeHeight="12" behindDoc="0" locked="0" layoutInCell="0" allowOverlap="1">
             <wp:simplePos x="0" y="0"/>
             <wp:positionH relativeFrom="column">
-              <wp:posOffset>23495</wp:posOffset>
+              <wp:align>center</wp:align>
             </wp:positionH>
             <wp:positionV relativeFrom="paragraph">
-              <wp:posOffset>141605</wp:posOffset>
+              <wp:posOffset>635</wp:posOffset>
             </wp:positionV>
-            <wp:extent cx="5868035" cy="813435"/>
+            <wp:extent cx="6332220" cy="1166495"/>
             <wp:effectExtent l="0" t="0" r="0" b="0"/>
             <wp:wrapSquare wrapText="largest"/>
-            <wp:docPr id="6" name="Imagen6"/>
+            <wp:docPr id="6" name="Imagen19"/>
             <wp:cNvGraphicFramePr>
               <a:graphicFrameLocks xmlns:a="http://schemas.openxmlformats.org/drawingml/2006/main" noChangeAspect="1"/>
             </wp:cNvGraphicFramePr>
@@ -530,7 +645,7 @@
               <a:graphicData uri="http://schemas.openxmlformats.org/drawingml/2006/picture">
                 <pic:pic xmlns:pic="http://schemas.openxmlformats.org/drawingml/2006/picture">
                   <pic:nvPicPr>
-                    <pic:cNvPr id="6" name="Imagen6"/>
+                    <pic:cNvPr id="6" name="Imagen19"/>
                     <pic:cNvPicPr>
                       <a:picLocks noChangeAspect="1" noChangeArrowheads="1"/>
                     </pic:cNvPicPr>
@@ -544,7 +659,7 @@
                   <pic:spPr bwMode="auto">
                     <a:xfrm>
                       <a:off x="0" y="0"/>
-                      <a:ext cx="5868035" cy="813435"/>
+                      <a:ext cx="6332220" cy="1166495"/>
                     </a:xfrm>
                     <a:prstGeom prst="rect">
                       <a:avLst/>
@@ -557,107 +672,32 @@
           </wp:anchor>
         </w:drawing>
       </w:r>
-      <w:r>
-        <w:rPr/>
-        <w:t xml:space="preserve"> </w:t>
-      </w:r>
-    </w:p>
-    <w:p>
-      <w:pPr>
-        <w:pStyle w:val="Normal"/>
-        <w:bidi w:val="0"/>
-        <w:jc w:val="start"/>
-        <w:rPr/>
-      </w:pPr>
-      <w:r>
-        <w:rPr/>
-      </w:r>
-    </w:p>
-    <w:p>
-      <w:pPr>
-        <w:pStyle w:val="Normal"/>
-        <w:bidi w:val="0"/>
-        <w:jc w:val="start"/>
-        <w:rPr/>
-      </w:pPr>
-      <w:r>
-        <w:rPr/>
-      </w:r>
-    </w:p>
-    <w:p>
-      <w:pPr>
-        <w:pStyle w:val="Normal"/>
-        <w:bidi w:val="0"/>
-        <w:jc w:val="start"/>
-        <w:rPr/>
-      </w:pPr>
-      <w:r>
-        <w:rPr/>
-      </w:r>
-    </w:p>
-    <w:p>
-      <w:pPr>
-        <w:pStyle w:val="Normal"/>
-        <w:bidi w:val="0"/>
-        <w:jc w:val="start"/>
-        <w:rPr/>
-      </w:pPr>
-      <w:r>
-        <w:rPr/>
-      </w:r>
-    </w:p>
-    <w:p>
-      <w:pPr>
-        <w:pStyle w:val="Normal"/>
-        <w:bidi w:val="0"/>
-        <w:jc w:val="start"/>
-        <w:rPr/>
-      </w:pPr>
-      <w:r>
-        <w:rPr/>
-      </w:r>
-    </w:p>
-    <w:p>
-      <w:pPr>
-        <w:pStyle w:val="Normal"/>
-        <w:bidi w:val="0"/>
-        <w:jc w:val="start"/>
-        <w:rPr/>
-      </w:pPr>
-      <w:r>
-        <w:rPr/>
-        <w:t xml:space="preserve">6.- </w:t>
-      </w:r>
-      <w:r>
-        <w:rPr/>
-        <w:t>Verificar el Despliegue (Deployment) y el Servicio (Service)</w:t>
-      </w:r>
-    </w:p>
-    <w:p>
-      <w:pPr>
-        <w:pStyle w:val="Normal"/>
-        <w:bidi w:val="0"/>
-        <w:jc w:val="start"/>
-        <w:rPr/>
-      </w:pPr>
-      <w:r>
-        <w:rPr/>
-      </w:r>
-    </w:p>
-    <w:p>
-      <w:pPr>
-        <w:pStyle w:val="Normal"/>
-        <w:bidi w:val="0"/>
-        <w:jc w:val="start"/>
-        <w:rPr/>
-      </w:pPr>
-      <w:r>
-        <w:rPr/>
-        <w:t xml:space="preserve">6.1.- </w:t>
-      </w:r>
-      <w:r>
-        <w:rPr/>
-        <w:t>Obtener el Deployment</w:t>
+    </w:p>
+    <w:p>
+      <w:pPr>
+        <w:pStyle w:val="Normal"/>
+        <w:bidi w:val="0"/>
+        <w:jc w:val="start"/>
+        <w:rPr/>
+      </w:pPr>
+      <w:r>
+        <w:rPr/>
+        <w:t xml:space="preserve">7.- </w:t>
+      </w:r>
+      <w:r>
+        <w:rPr/>
+        <w:t>Inspeccionar las Variables de Entorno dentro del Pod en ejecución</w:t>
+      </w:r>
+    </w:p>
+    <w:p>
+      <w:pPr>
+        <w:pStyle w:val="Normal"/>
+        <w:bidi w:val="0"/>
+        <w:jc w:val="start"/>
+        <w:rPr/>
+      </w:pPr>
+      <w:r>
+        <w:rPr/>
       </w:r>
     </w:p>
     <w:p>
@@ -669,18 +709,18 @@
       </w:pPr>
       <w:r>
         <w:drawing>
-          <wp:anchor distT="0" distB="0" distL="0" distR="0" simplePos="0" relativeHeight="8" behindDoc="0" locked="0" layoutInCell="0" allowOverlap="1">
+          <wp:anchor distT="0" distB="0" distL="0" distR="0" simplePos="0" relativeHeight="13" behindDoc="0" locked="0" layoutInCell="0" allowOverlap="1">
             <wp:simplePos x="0" y="0"/>
             <wp:positionH relativeFrom="column">
-              <wp:posOffset>-8890</wp:posOffset>
+              <wp:align>center</wp:align>
             </wp:positionH>
             <wp:positionV relativeFrom="paragraph">
-              <wp:posOffset>170180</wp:posOffset>
+              <wp:posOffset>635</wp:posOffset>
             </wp:positionV>
-            <wp:extent cx="5716905" cy="683895"/>
+            <wp:extent cx="6332220" cy="2932430"/>
             <wp:effectExtent l="0" t="0" r="0" b="0"/>
             <wp:wrapSquare wrapText="largest"/>
-            <wp:docPr id="7" name="Imagen7"/>
+            <wp:docPr id="7" name="Imagen20"/>
             <wp:cNvGraphicFramePr>
               <a:graphicFrameLocks xmlns:a="http://schemas.openxmlformats.org/drawingml/2006/main" noChangeAspect="1"/>
             </wp:cNvGraphicFramePr>
@@ -688,7 +728,7 @@
               <a:graphicData uri="http://schemas.openxmlformats.org/drawingml/2006/picture">
                 <pic:pic xmlns:pic="http://schemas.openxmlformats.org/drawingml/2006/picture">
                   <pic:nvPicPr>
-                    <pic:cNvPr id="7" name="Imagen7"/>
+                    <pic:cNvPr id="7" name="Imagen20"/>
                     <pic:cNvPicPr>
                       <a:picLocks noChangeAspect="1" noChangeArrowheads="1"/>
                     </pic:cNvPicPr>
@@ -702,7 +742,7 @@
                   <pic:spPr bwMode="auto">
                     <a:xfrm>
                       <a:off x="0" y="0"/>
-                      <a:ext cx="5716905" cy="683895"/>
+                      <a:ext cx="6332220" cy="2932430"/>
                     </a:xfrm>
                     <a:prstGeom prst="rect">
                       <a:avLst/>
@@ -717,34 +757,23 @@
       </w:r>
       <w:r>
         <w:rPr/>
-        <w:t xml:space="preserve">  </w:t>
-      </w:r>
-    </w:p>
-    <w:p>
-      <w:pPr>
-        <w:pStyle w:val="Normal"/>
-        <w:bidi w:val="0"/>
-        <w:jc w:val="start"/>
-        <w:rPr/>
-      </w:pPr>
-      <w:r>
-        <w:rPr/>
-      </w:r>
-    </w:p>
-    <w:p>
-      <w:pPr>
-        <w:pStyle w:val="Normal"/>
-        <w:bidi w:val="0"/>
-        <w:jc w:val="start"/>
-        <w:rPr/>
-      </w:pPr>
-      <w:r>
-        <w:rPr/>
-        <w:t xml:space="preserve">6.2.- </w:t>
-      </w:r>
-      <w:r>
-        <w:rPr/>
-        <w:t>Obtener el Servicio</w:t>
+        <w:t xml:space="preserve"> </w:t>
+      </w:r>
+    </w:p>
+    <w:p>
+      <w:pPr>
+        <w:pStyle w:val="Normal"/>
+        <w:bidi w:val="0"/>
+        <w:jc w:val="start"/>
+        <w:rPr/>
+      </w:pPr>
+      <w:r>
+        <w:rPr/>
+        <w:t xml:space="preserve">8.- </w:t>
+      </w:r>
+      <w:r>
+        <w:rPr/>
+        <w:t>Obtener el ConfigMap</w:t>
       </w:r>
     </w:p>
     <w:p>
@@ -767,18 +796,18 @@
       </w:pPr>
       <w:r>
         <w:drawing>
-          <wp:anchor distT="0" distB="0" distL="0" distR="0" simplePos="0" relativeHeight="9" behindDoc="0" locked="0" layoutInCell="0" allowOverlap="1">
+          <wp:anchor distT="0" distB="0" distL="0" distR="0" simplePos="0" relativeHeight="14" behindDoc="0" locked="0" layoutInCell="0" allowOverlap="1">
             <wp:simplePos x="0" y="0"/>
             <wp:positionH relativeFrom="column">
-              <wp:posOffset>59690</wp:posOffset>
+              <wp:align>center</wp:align>
             </wp:positionH>
             <wp:positionV relativeFrom="paragraph">
-              <wp:posOffset>52705</wp:posOffset>
+              <wp:posOffset>635</wp:posOffset>
             </wp:positionV>
-            <wp:extent cx="6213475" cy="676910"/>
+            <wp:extent cx="6332220" cy="698500"/>
             <wp:effectExtent l="0" t="0" r="0" b="0"/>
             <wp:wrapSquare wrapText="largest"/>
-            <wp:docPr id="8" name="Imagen8"/>
+            <wp:docPr id="8" name="Imagen21"/>
             <wp:cNvGraphicFramePr>
               <a:graphicFrameLocks xmlns:a="http://schemas.openxmlformats.org/drawingml/2006/main" noChangeAspect="1"/>
             </wp:cNvGraphicFramePr>
@@ -786,7 +815,7 @@
               <a:graphicData uri="http://schemas.openxmlformats.org/drawingml/2006/picture">
                 <pic:pic xmlns:pic="http://schemas.openxmlformats.org/drawingml/2006/picture">
                   <pic:nvPicPr>
-                    <pic:cNvPr id="8" name="Imagen8"/>
+                    <pic:cNvPr id="8" name="Imagen21"/>
                     <pic:cNvPicPr>
                       <a:picLocks noChangeAspect="1" noChangeArrowheads="1"/>
                     </pic:cNvPicPr>
@@ -800,7 +829,7 @@
                   <pic:spPr bwMode="auto">
                     <a:xfrm>
                       <a:off x="0" y="0"/>
-                      <a:ext cx="6213475" cy="676910"/>
+                      <a:ext cx="6332220" cy="698500"/>
                     </a:xfrm>
                     <a:prstGeom prst="rect">
                       <a:avLst/>
@@ -815,57 +844,37 @@
       </w:r>
       <w:r>
         <w:rPr/>
-        <w:t xml:space="preserve"> </w:t>
-      </w:r>
-    </w:p>
-    <w:p>
-      <w:pPr>
-        <w:pStyle w:val="Normal"/>
-        <w:bidi w:val="0"/>
-        <w:jc w:val="start"/>
-        <w:rPr/>
-      </w:pPr>
-      <w:r>
-        <w:rPr/>
-        <w:t xml:space="preserve">7.- </w:t>
-      </w:r>
-      <w:r>
-        <w:rPr/>
-        <w:t>Ver los logs de la aplicación NestJS</w:t>
-      </w:r>
-    </w:p>
-    <w:p>
-      <w:pPr>
-        <w:pStyle w:val="Normal"/>
-        <w:bidi w:val="0"/>
-        <w:jc w:val="start"/>
-        <w:rPr/>
-      </w:pPr>
-      <w:r>
-        <w:rPr/>
-      </w:r>
-    </w:p>
-    <w:p>
-      <w:pPr>
-        <w:pStyle w:val="Normal"/>
-        <w:bidi w:val="0"/>
-        <w:jc w:val="start"/>
-        <w:rPr/>
-      </w:pPr>
-      <w:r>
-        <w:rPr/>
-      </w:r>
-    </w:p>
-    <w:p>
-      <w:pPr>
-        <w:pStyle w:val="Normal"/>
-        <w:bidi w:val="0"/>
-        <w:jc w:val="start"/>
-        <w:rPr/>
-      </w:pPr>
-      <w:r>
+        <w:br/>
+        <w:br/>
+        <w:t xml:space="preserve">9.- </w:t>
+      </w:r>
+      <w:r>
+        <w:rPr/>
+        <w:t>Obtener el Secreto</w:t>
+      </w:r>
+    </w:p>
+    <w:p>
+      <w:pPr>
+        <w:pStyle w:val="Normal"/>
+        <w:bidi w:val="0"/>
+        <w:jc w:val="start"/>
+        <w:rPr/>
+      </w:pPr>
+      <w:r>
+        <w:rPr/>
+      </w:r>
+    </w:p>
+    <w:p>
+      <w:pPr>
+        <w:pStyle w:val="Normal"/>
+        <w:bidi w:val="0"/>
+        <w:jc w:val="start"/>
+        <w:rPr/>
+      </w:pPr>
+      <w:r>
+        <w:rPr/>
         <w:drawing>
-          <wp:anchor distT="0" distB="0" distL="0" distR="0" simplePos="0" relativeHeight="10" behindDoc="0" locked="0" layoutInCell="0" allowOverlap="1">
+          <wp:anchor distT="0" distB="0" distL="0" distR="0" simplePos="0" relativeHeight="15" behindDoc="0" locked="0" layoutInCell="0" allowOverlap="1">
             <wp:simplePos x="0" y="0"/>
             <wp:positionH relativeFrom="column">
               <wp:align>center</wp:align>
@@ -873,10 +882,10 @@
             <wp:positionV relativeFrom="paragraph">
               <wp:posOffset>635</wp:posOffset>
             </wp:positionV>
-            <wp:extent cx="6332220" cy="1124585"/>
+            <wp:extent cx="6332220" cy="669925"/>
             <wp:effectExtent l="0" t="0" r="0" b="0"/>
             <wp:wrapSquare wrapText="largest"/>
-            <wp:docPr id="9" name="Imagen9"/>
+            <wp:docPr id="9" name="Imagen22"/>
             <wp:cNvGraphicFramePr>
               <a:graphicFrameLocks xmlns:a="http://schemas.openxmlformats.org/drawingml/2006/main" noChangeAspect="1"/>
             </wp:cNvGraphicFramePr>
@@ -884,7 +893,7 @@
               <a:graphicData uri="http://schemas.openxmlformats.org/drawingml/2006/picture">
                 <pic:pic xmlns:pic="http://schemas.openxmlformats.org/drawingml/2006/picture">
                   <pic:nvPicPr>
-                    <pic:cNvPr id="9" name="Imagen9"/>
+                    <pic:cNvPr id="9" name="Imagen22"/>
                     <pic:cNvPicPr>
                       <a:picLocks noChangeAspect="1" noChangeArrowheads="1"/>
                     </pic:cNvPicPr>
@@ -898,7 +907,7 @@
                   <pic:spPr bwMode="auto">
                     <a:xfrm>
                       <a:off x="0" y="0"/>
-                      <a:ext cx="6332220" cy="1124585"/>
+                      <a:ext cx="6332220" cy="669925"/>
                     </a:xfrm>
                     <a:prstGeom prst="rect">
                       <a:avLst/>
@@ -911,116 +920,28 @@
           </wp:anchor>
         </w:drawing>
       </w:r>
-      <w:r>
-        <w:rPr/>
-        <w:t xml:space="preserve"> </w:t>
-      </w:r>
-    </w:p>
-    <w:p>
-      <w:pPr>
-        <w:pStyle w:val="Normal"/>
-        <w:bidi w:val="0"/>
-        <w:jc w:val="start"/>
-        <w:rPr/>
-      </w:pPr>
-      <w:r>
-        <w:rPr/>
-        <w:t xml:space="preserve">8.- </w:t>
-      </w:r>
-      <w:r>
-        <w:rPr/>
-        <w:t>Verificar las Variables de Entorno inyectadas en vivo</w:t>
-      </w:r>
-    </w:p>
-    <w:p>
-      <w:pPr>
-        <w:pStyle w:val="Normal"/>
-        <w:bidi w:val="0"/>
-        <w:jc w:val="start"/>
-        <w:rPr/>
-      </w:pPr>
-      <w:r>
-        <w:rPr/>
-      </w:r>
-    </w:p>
-    <w:p>
-      <w:pPr>
-        <w:pStyle w:val="Normal"/>
-        <w:bidi w:val="0"/>
-        <w:jc w:val="start"/>
-        <w:rPr/>
-      </w:pPr>
-      <w:r>
-        <w:rPr/>
+    </w:p>
+    <w:p>
+      <w:pPr>
+        <w:pStyle w:val="Normal"/>
+        <w:bidi w:val="0"/>
+        <w:jc w:val="start"/>
+        <w:rPr/>
+      </w:pPr>
+      <w:r>
+        <w:rPr/>
+      </w:r>
+    </w:p>
+    <w:p>
+      <w:pPr>
+        <w:pStyle w:val="Normal"/>
+        <w:bidi w:val="0"/>
+        <w:jc w:val="start"/>
+        <w:rPr/>
+      </w:pPr>
+      <w:r>
         <w:drawing>
-          <wp:anchor distT="0" distB="0" distL="0" distR="0" simplePos="0" relativeHeight="11" behindDoc="0" locked="0" layoutInCell="0" allowOverlap="1">
-            <wp:simplePos x="0" y="0"/>
-            <wp:positionH relativeFrom="column">
-              <wp:align>center</wp:align>
-            </wp:positionH>
-            <wp:positionV relativeFrom="paragraph">
-              <wp:posOffset>635</wp:posOffset>
-            </wp:positionV>
-            <wp:extent cx="6332220" cy="437515"/>
-            <wp:effectExtent l="0" t="0" r="0" b="0"/>
-            <wp:wrapSquare wrapText="largest"/>
-            <wp:docPr id="10" name="Imagen10"/>
-            <wp:cNvGraphicFramePr>
-              <a:graphicFrameLocks xmlns:a="http://schemas.openxmlformats.org/drawingml/2006/main" noChangeAspect="1"/>
-            </wp:cNvGraphicFramePr>
-            <a:graphic xmlns:a="http://schemas.openxmlformats.org/drawingml/2006/main">
-              <a:graphicData uri="http://schemas.openxmlformats.org/drawingml/2006/picture">
-                <pic:pic xmlns:pic="http://schemas.openxmlformats.org/drawingml/2006/picture">
-                  <pic:nvPicPr>
-                    <pic:cNvPr id="10" name="Imagen10"/>
-                    <pic:cNvPicPr>
-                      <a:picLocks noChangeAspect="1" noChangeArrowheads="1"/>
-                    </pic:cNvPicPr>
-                  </pic:nvPicPr>
-                  <pic:blipFill>
-                    <a:blip r:embed="rId11"/>
-                    <a:stretch>
-                      <a:fillRect/>
-                    </a:stretch>
-                  </pic:blipFill>
-                  <pic:spPr bwMode="auto">
-                    <a:xfrm>
-                      <a:off x="0" y="0"/>
-                      <a:ext cx="6332220" cy="437515"/>
-                    </a:xfrm>
-                    <a:prstGeom prst="rect">
-                      <a:avLst/>
-                    </a:prstGeom>
-                    <a:noFill/>
-                  </pic:spPr>
-                </pic:pic>
-              </a:graphicData>
-            </a:graphic>
-          </wp:anchor>
-        </w:drawing>
-      </w:r>
-    </w:p>
-    <w:p>
-      <w:pPr>
-        <w:pStyle w:val="Normal"/>
-        <w:bidi w:val="0"/>
-        <w:jc w:val="start"/>
-        <w:rPr/>
-      </w:pPr>
-      <w:r>
-        <w:rPr/>
-      </w:r>
-    </w:p>
-    <w:p>
-      <w:pPr>
-        <w:pStyle w:val="Normal"/>
-        <w:bidi w:val="0"/>
-        <w:jc w:val="start"/>
-        <w:rPr/>
-      </w:pPr>
-      <w:r>
-        <w:drawing>
-          <wp:anchor distT="0" distB="0" distL="0" distR="0" simplePos="0" relativeHeight="13" behindDoc="0" locked="0" layoutInCell="0" allowOverlap="1">
+          <wp:anchor distT="0" distB="0" distL="0" distR="0" simplePos="0" relativeHeight="5" behindDoc="0" locked="0" layoutInCell="0" allowOverlap="1">
             <wp:simplePos x="0" y="0"/>
             <wp:positionH relativeFrom="column">
               <wp:posOffset>0</wp:posOffset>
@@ -1031,7 +952,7 @@
             <wp:extent cx="6332220" cy="649605"/>
             <wp:effectExtent l="0" t="0" r="0" b="0"/>
             <wp:wrapSquare wrapText="largest"/>
-            <wp:docPr id="11" name="Imagen12"/>
+            <wp:docPr id="10" name="Imagen12"/>
             <wp:cNvGraphicFramePr>
               <a:graphicFrameLocks xmlns:a="http://schemas.openxmlformats.org/drawingml/2006/main" noChangeAspect="1"/>
             </wp:cNvGraphicFramePr>
@@ -1039,13 +960,13 @@
               <a:graphicData uri="http://schemas.openxmlformats.org/drawingml/2006/picture">
                 <pic:pic xmlns:pic="http://schemas.openxmlformats.org/drawingml/2006/picture">
                   <pic:nvPicPr>
-                    <pic:cNvPr id="11" name="Imagen12"/>
+                    <pic:cNvPr id="10" name="Imagen12"/>
                     <pic:cNvPicPr>
                       <a:picLocks noChangeAspect="1" noChangeArrowheads="1"/>
                     </pic:cNvPicPr>
                   </pic:nvPicPr>
                   <pic:blipFill>
-                    <a:blip r:embed="rId12"/>
+                    <a:blip r:embed="rId11"/>
                     <a:stretch>
                       <a:fillRect/>
                     </a:stretch>
@@ -1068,7 +989,7 @@
       </w:r>
       <w:r>
         <w:rPr/>
-        <w:t>9.- Pruebas de la aplicacion</w:t>
+        <w:t>9.- Pruebas de la aplicación</w:t>
       </w:r>
     </w:p>
     <w:p>
@@ -1080,7 +1001,7 @@
       </w:pPr>
       <w:r>
         <w:drawing>
-          <wp:anchor distT="0" distB="0" distL="0" distR="0" simplePos="0" relativeHeight="12" behindDoc="0" locked="0" layoutInCell="0" allowOverlap="1">
+          <wp:anchor distT="0" distB="0" distL="0" distR="0" simplePos="0" relativeHeight="4" behindDoc="0" locked="0" layoutInCell="0" allowOverlap="1">
             <wp:simplePos x="0" y="0"/>
             <wp:positionH relativeFrom="column">
               <wp:posOffset>5080</wp:posOffset>
@@ -1091,7 +1012,7 @@
             <wp:extent cx="5716905" cy="547370"/>
             <wp:effectExtent l="0" t="0" r="0" b="0"/>
             <wp:wrapSquare wrapText="largest"/>
-            <wp:docPr id="12" name="Imagen11"/>
+            <wp:docPr id="11" name="Imagen11"/>
             <wp:cNvGraphicFramePr>
               <a:graphicFrameLocks xmlns:a="http://schemas.openxmlformats.org/drawingml/2006/main" noChangeAspect="1"/>
             </wp:cNvGraphicFramePr>
@@ -1099,13 +1020,13 @@
               <a:graphicData uri="http://schemas.openxmlformats.org/drawingml/2006/picture">
                 <pic:pic xmlns:pic="http://schemas.openxmlformats.org/drawingml/2006/picture">
                   <pic:nvPicPr>
-                    <pic:cNvPr id="12" name="Imagen11"/>
+                    <pic:cNvPr id="11" name="Imagen11"/>
                     <pic:cNvPicPr>
                       <a:picLocks noChangeAspect="1" noChangeArrowheads="1"/>
                     </pic:cNvPicPr>
                   </pic:nvPicPr>
                   <pic:blipFill>
-                    <a:blip r:embed="rId13"/>
+                    <a:blip r:embed="rId12"/>
                     <a:stretch>
                       <a:fillRect/>
                     </a:stretch>
@@ -1168,7 +1089,7 @@
       </w:r>
       <w:r>
         <w:rPr/>
-        <w:t>Validar el ConfigMap y el Secret de manera individual</w:t>
+        <w:t>Historial de ejecuciones en Jenkins Stage View y confirmación de despliegue exitoso (Build #15)</w:t>
       </w:r>
     </w:p>
     <w:p>
@@ -1204,7 +1125,7 @@
       <w:r>
         <w:rPr/>
         <w:drawing>
-          <wp:anchor distT="0" distB="0" distL="0" distR="0" simplePos="0" relativeHeight="15" behindDoc="0" locked="0" layoutInCell="0" allowOverlap="1">
+          <wp:anchor distT="0" distB="0" distL="0" distR="0" simplePos="0" relativeHeight="7" behindDoc="0" locked="0" layoutInCell="0" allowOverlap="1">
             <wp:simplePos x="0" y="0"/>
             <wp:positionH relativeFrom="column">
               <wp:posOffset>-42545</wp:posOffset>
@@ -1215,7 +1136,7 @@
             <wp:extent cx="6332220" cy="676910"/>
             <wp:effectExtent l="0" t="0" r="0" b="0"/>
             <wp:wrapSquare wrapText="largest"/>
-            <wp:docPr id="13" name="Imagen14"/>
+            <wp:docPr id="12" name="Imagen14"/>
             <wp:cNvGraphicFramePr>
               <a:graphicFrameLocks xmlns:a="http://schemas.openxmlformats.org/drawingml/2006/main" noChangeAspect="1"/>
             </wp:cNvGraphicFramePr>
@@ -1223,13 +1144,13 @@
               <a:graphicData uri="http://schemas.openxmlformats.org/drawingml/2006/picture">
                 <pic:pic xmlns:pic="http://schemas.openxmlformats.org/drawingml/2006/picture">
                   <pic:nvPicPr>
-                    <pic:cNvPr id="13" name="Imagen14"/>
+                    <pic:cNvPr id="12" name="Imagen14"/>
                     <pic:cNvPicPr>
                       <a:picLocks noChangeAspect="1" noChangeArrowheads="1"/>
                     </pic:cNvPicPr>
                   </pic:nvPicPr>
                   <pic:blipFill>
-                    <a:blip r:embed="rId14"/>
+                    <a:blip r:embed="rId13"/>
                     <a:stretch>
                       <a:fillRect/>
                     </a:stretch>
@@ -1250,7 +1171,7 @@
           </wp:anchor>
         </w:drawing>
         <w:drawing>
-          <wp:anchor distT="0" distB="0" distL="0" distR="0" simplePos="0" relativeHeight="14" behindDoc="0" locked="0" layoutInCell="0" allowOverlap="1">
+          <wp:anchor distT="0" distB="0" distL="0" distR="0" simplePos="0" relativeHeight="6" behindDoc="0" locked="0" layoutInCell="0" allowOverlap="1">
             <wp:simplePos x="0" y="0"/>
             <wp:positionH relativeFrom="column">
               <wp:align>center</wp:align>
@@ -1261,7 +1182,7 @@
             <wp:extent cx="6332220" cy="1280795"/>
             <wp:effectExtent l="0" t="0" r="0" b="0"/>
             <wp:wrapSquare wrapText="largest"/>
-            <wp:docPr id="14" name="Imagen13"/>
+            <wp:docPr id="13" name="Imagen13"/>
             <wp:cNvGraphicFramePr>
               <a:graphicFrameLocks xmlns:a="http://schemas.openxmlformats.org/drawingml/2006/main" noChangeAspect="1"/>
             </wp:cNvGraphicFramePr>
@@ -1269,7 +1190,53 @@
               <a:graphicData uri="http://schemas.openxmlformats.org/drawingml/2006/picture">
                 <pic:pic xmlns:pic="http://schemas.openxmlformats.org/drawingml/2006/picture">
                   <pic:nvPicPr>
-                    <pic:cNvPr id="14" name="Imagen13"/>
+                    <pic:cNvPr id="13" name="Imagen13"/>
+                    <pic:cNvPicPr>
+                      <a:picLocks noChangeAspect="1" noChangeArrowheads="1"/>
+                    </pic:cNvPicPr>
+                  </pic:nvPicPr>
+                  <pic:blipFill>
+                    <a:blip r:embed="rId14"/>
+                    <a:stretch>
+                      <a:fillRect/>
+                    </a:stretch>
+                  </pic:blipFill>
+                  <pic:spPr bwMode="auto">
+                    <a:xfrm>
+                      <a:off x="0" y="0"/>
+                      <a:ext cx="6332220" cy="1280795"/>
+                    </a:xfrm>
+                    <a:prstGeom prst="rect">
+                      <a:avLst/>
+                    </a:prstGeom>
+                    <a:noFill/>
+                  </pic:spPr>
+                </pic:pic>
+              </a:graphicData>
+            </a:graphic>
+          </wp:anchor>
+        </w:drawing>
+        <w:drawing>
+          <wp:anchor distT="0" distB="0" distL="0" distR="0" simplePos="0" relativeHeight="8" behindDoc="0" locked="0" layoutInCell="0" allowOverlap="1">
+            <wp:simplePos x="0" y="0"/>
+            <wp:positionH relativeFrom="column">
+              <wp:align>center</wp:align>
+            </wp:positionH>
+            <wp:positionV relativeFrom="paragraph">
+              <wp:posOffset>635</wp:posOffset>
+            </wp:positionV>
+            <wp:extent cx="6332220" cy="3620135"/>
+            <wp:effectExtent l="0" t="0" r="0" b="0"/>
+            <wp:wrapSquare wrapText="largest"/>
+            <wp:docPr id="14" name="Imagen15"/>
+            <wp:cNvGraphicFramePr>
+              <a:graphicFrameLocks xmlns:a="http://schemas.openxmlformats.org/drawingml/2006/main" noChangeAspect="1"/>
+            </wp:cNvGraphicFramePr>
+            <a:graphic xmlns:a="http://schemas.openxmlformats.org/drawingml/2006/main">
+              <a:graphicData uri="http://schemas.openxmlformats.org/drawingml/2006/picture">
+                <pic:pic xmlns:pic="http://schemas.openxmlformats.org/drawingml/2006/picture">
+                  <pic:nvPicPr>
+                    <pic:cNvPr id="14" name="Imagen15"/>
                     <pic:cNvPicPr>
                       <a:picLocks noChangeAspect="1" noChangeArrowheads="1"/>
                     </pic:cNvPicPr>
@@ -1283,7 +1250,7 @@
                   <pic:spPr bwMode="auto">
                     <a:xfrm>
                       <a:off x="0" y="0"/>
-                      <a:ext cx="6332220" cy="1280795"/>
+                      <a:ext cx="6332220" cy="3620135"/>
                     </a:xfrm>
                     <a:prstGeom prst="rect">
                       <a:avLst/>

</xml_diff>